<commit_message>
Sync regenerated resume.pdf/docx from redundant predeploy run
Byte-identical content, different embedded timestamps from re-running
the generator during npm run deploy.
</commit_message>
<xml_diff>
--- a/build/assets/resume.docx
+++ b/build/assets/resume.docx
@@ -411,7 +411,7 @@
         </w:rPr>
         <w:t xml:space="preserve">   —   </w:t>
       </w:r>
-      <w:hyperlink w:history="1" r:id="rId8aw19wwclh3mv9aq9x075">
+      <w:hyperlink w:history="1" r:id="rIdaez5emw_lqs7lttczyxz9">
         <w:r>
           <w:rPr>
             <w:rStyle w:val="Hyperlink"/>
@@ -465,7 +465,7 @@
         </w:rPr>
         <w:t xml:space="preserve">   —   </w:t>
       </w:r>
-      <w:hyperlink w:history="1" r:id="rIdfuffievw_zig1ecgn1rkm">
+      <w:hyperlink w:history="1" r:id="rIdwt97lic9xxw5nuvrdwt9y">
         <w:r>
           <w:rPr>
             <w:rStyle w:val="Hyperlink"/>
@@ -519,7 +519,7 @@
         </w:rPr>
         <w:t xml:space="preserve">   —   </w:t>
       </w:r>
-      <w:hyperlink w:history="1" r:id="rIdvibnfwd0rom0usewkhmnq">
+      <w:hyperlink w:history="1" r:id="rIdjo92wrxv6lyvzw58tkpkb">
         <w:r>
           <w:rPr>
             <w:rStyle w:val="Hyperlink"/>
@@ -573,7 +573,7 @@
         </w:rPr>
         <w:t xml:space="preserve">   —   </w:t>
       </w:r>
-      <w:hyperlink w:history="1" r:id="rIdtmtzowovcgmt3gepu9d7p">
+      <w:hyperlink w:history="1" r:id="rIdfu_t89nohag4ul5ahzkt9">
         <w:r>
           <w:rPr>
             <w:rStyle w:val="Hyperlink"/>
@@ -627,7 +627,7 @@
         </w:rPr>
         <w:t xml:space="preserve">   —   </w:t>
       </w:r>
-      <w:hyperlink w:history="1" r:id="rId7el7elkgfhdgdtj4ubya0">
+      <w:hyperlink w:history="1" r:id="rIdgn6iccqck2ddzas2luhel">
         <w:r>
           <w:rPr>
             <w:rStyle w:val="Hyperlink"/>
@@ -681,7 +681,7 @@
         </w:rPr>
         <w:t xml:space="preserve">   —   </w:t>
       </w:r>
-      <w:hyperlink w:history="1" r:id="rIdprtejcbtgdszohtfshtw6">
+      <w:hyperlink w:history="1" r:id="rIdy9xn_tybbxcy9vmaufgk0">
         <w:r>
           <w:rPr>
             <w:rStyle w:val="Hyperlink"/>
@@ -735,7 +735,7 @@
         </w:rPr>
         <w:t xml:space="preserve">   —   </w:t>
       </w:r>
-      <w:hyperlink w:history="1" r:id="rIdvmqus4mlyeux9pa8kg5ae">
+      <w:hyperlink w:history="1" r:id="rIdc93f8fytdkyg8ak4gjyzx">
         <w:r>
           <w:rPr>
             <w:rStyle w:val="Hyperlink"/>

</xml_diff>